<commit_message>
fix: adding date to document
</commit_message>
<xml_diff>
--- a/VZOR - Záväzné vyjadrenie DPO.docx
+++ b/VZOR - Záväzné vyjadrenie DPO.docx
@@ -16,7 +16,7 @@
     <w:tbl>
       <w:tblPr>
         <w:tblStyle w:val="Mriekatabuky"/>
-        <w:tblpPr w:bottomFromText="0" w:horzAnchor="page" w:leftFromText="0" w:rightFromText="0" w:tblpX="1135" w:tblpY="2496" w:topFromText="0" w:vertAnchor="page"/>
+        <w:tblpPr w:vertAnchor="page" w:horzAnchor="page" w:tblpX="1135" w:tblpY="2496"/>
         <w:tblW w:w="10065" w:type="dxa"/>
         <w:jc w:val="start"/>
         <w:tblInd w:w="0" w:type="dxa"/>
@@ -30,27 +30,22 @@
         <w:tblLook w:val="04a0" w:noHBand="0" w:noVBand="1" w:firstColumn="1" w:lastRow="0" w:lastColumn="0" w:firstRow="1"/>
       </w:tblPr>
       <w:tblGrid>
-        <w:gridCol w:w="5513"/>
+        <w:gridCol w:w="5512"/>
         <w:gridCol w:w="20"/>
-        <w:gridCol w:w="4532"/>
+        <w:gridCol w:w="4533"/>
       </w:tblGrid>
       <w:tr>
         <w:trPr/>
         <w:tc>
           <w:tcPr>
-            <w:tcW w:w="5513" w:type="dxa"/>
+            <w:tcW w:w="5512" w:type="dxa"/>
             <w:vMerge w:val="restart"/>
-            <w:tcBorders>
-              <w:top w:val="nil"/>
-              <w:start w:val="nil"/>
-              <w:bottom w:val="nil"/>
-              <w:end w:val="nil"/>
-            </w:tcBorders>
-          </w:tcPr>
-          <w:p>
-            <w:pPr>
-              <w:pStyle w:val="Normal"/>
-              <w:widowControl/>
+            <w:tcBorders/>
+          </w:tcPr>
+          <w:p>
+            <w:pPr>
+              <w:pStyle w:val="Normal"/>
+              <w:widowControl w:val="false"/>
               <w:bidi w:val="0"/>
               <w:spacing w:lineRule="auto" w:line="240" w:before="0" w:after="0"/>
               <w:jc w:val="start"/>
@@ -75,19 +70,16 @@
         </w:tc>
         <w:tc>
           <w:tcPr>
-            <w:tcW w:w="4552" w:type="dxa"/>
+            <w:tcW w:w="4553" w:type="dxa"/>
             <w:gridSpan w:val="2"/>
             <w:tcBorders>
-              <w:top w:val="nil"/>
-              <w:start w:val="nil"/>
               <w:bottom w:val="single" w:sz="4" w:space="0" w:color="808080"/>
-              <w:end w:val="nil"/>
             </w:tcBorders>
           </w:tcPr>
           <w:p>
             <w:pPr>
               <w:pStyle w:val="Normal"/>
-              <w:widowControl/>
+              <w:widowControl w:val="false"/>
               <w:bidi w:val="0"/>
               <w:spacing w:lineRule="auto" w:line="240" w:before="0" w:after="0"/>
               <w:jc w:val="start"/>
@@ -115,19 +107,16 @@
         <w:trPr/>
         <w:tc>
           <w:tcPr>
-            <w:tcW w:w="5513" w:type="dxa"/>
+            <w:tcW w:w="5512" w:type="dxa"/>
             <w:vMerge w:val="continue"/>
             <w:tcBorders>
-              <w:top w:val="nil"/>
-              <w:start w:val="nil"/>
-              <w:bottom w:val="nil"/>
               <w:end w:val="single" w:sz="4" w:space="0" w:color="808080"/>
             </w:tcBorders>
           </w:tcPr>
           <w:p>
             <w:pPr>
               <w:pStyle w:val="Normal"/>
-              <w:widowControl/>
+              <w:widowControl w:val="false"/>
               <w:bidi w:val="0"/>
               <w:spacing w:lineRule="auto" w:line="240" w:before="0" w:after="0"/>
               <w:jc w:val="start"/>
@@ -152,12 +141,11 @@
         </w:tc>
         <w:tc>
           <w:tcPr>
-            <w:tcW w:w="4552" w:type="dxa"/>
+            <w:tcW w:w="4553" w:type="dxa"/>
             <w:gridSpan w:val="2"/>
             <w:tcBorders>
               <w:top w:val="single" w:sz="4" w:space="0" w:color="808080"/>
               <w:start w:val="single" w:sz="4" w:space="0" w:color="808080"/>
-              <w:bottom w:val="nil"/>
               <w:end w:val="single" w:sz="4" w:space="0" w:color="808080"/>
             </w:tcBorders>
             <w:tcMar>
@@ -168,7 +156,7 @@
           <w:p>
             <w:pPr>
               <w:pStyle w:val="Normal"/>
-              <w:widowControl/>
+              <w:widowControl w:val="false"/>
               <w:bidi w:val="0"/>
               <w:spacing w:lineRule="auto" w:line="240" w:before="0" w:after="0"/>
               <w:jc w:val="start"/>
@@ -198,19 +186,16 @@
         <w:trPr/>
         <w:tc>
           <w:tcPr>
-            <w:tcW w:w="5513" w:type="dxa"/>
+            <w:tcW w:w="5512" w:type="dxa"/>
             <w:vMerge w:val="continue"/>
             <w:tcBorders>
-              <w:top w:val="nil"/>
-              <w:start w:val="nil"/>
-              <w:bottom w:val="nil"/>
               <w:end w:val="single" w:sz="4" w:space="0" w:color="808080"/>
             </w:tcBorders>
           </w:tcPr>
           <w:p>
             <w:pPr>
               <w:pStyle w:val="Normal"/>
-              <w:widowControl/>
+              <w:widowControl w:val="false"/>
               <w:bidi w:val="0"/>
               <w:spacing w:lineRule="auto" w:line="240" w:before="0" w:after="0"/>
               <w:jc w:val="start"/>
@@ -235,12 +220,10 @@
         </w:tc>
         <w:tc>
           <w:tcPr>
-            <w:tcW w:w="4552" w:type="dxa"/>
+            <w:tcW w:w="4553" w:type="dxa"/>
             <w:gridSpan w:val="2"/>
             <w:tcBorders>
-              <w:top w:val="nil"/>
               <w:start w:val="single" w:sz="4" w:space="0" w:color="808080"/>
-              <w:bottom w:val="nil"/>
               <w:end w:val="single" w:sz="4" w:space="0" w:color="808080"/>
             </w:tcBorders>
             <w:tcMar>
@@ -251,7 +234,7 @@
           <w:p>
             <w:pPr>
               <w:pStyle w:val="Normal"/>
-              <w:widowControl/>
+              <w:widowControl w:val="false"/>
               <w:bidi w:val="0"/>
               <w:spacing w:lineRule="auto" w:line="240" w:before="0" w:after="0"/>
               <w:jc w:val="start"/>
@@ -280,19 +263,16 @@
         <w:trPr/>
         <w:tc>
           <w:tcPr>
-            <w:tcW w:w="5513" w:type="dxa"/>
+            <w:tcW w:w="5512" w:type="dxa"/>
             <w:vMerge w:val="continue"/>
             <w:tcBorders>
-              <w:top w:val="nil"/>
-              <w:start w:val="nil"/>
-              <w:bottom w:val="nil"/>
               <w:end w:val="single" w:sz="4" w:space="0" w:color="808080"/>
             </w:tcBorders>
           </w:tcPr>
           <w:p>
             <w:pPr>
               <w:pStyle w:val="Normal"/>
-              <w:widowControl/>
+              <w:widowControl w:val="false"/>
               <w:bidi w:val="0"/>
               <w:spacing w:lineRule="auto" w:line="240" w:before="0" w:after="0"/>
               <w:jc w:val="start"/>
@@ -317,12 +297,10 @@
         </w:tc>
         <w:tc>
           <w:tcPr>
-            <w:tcW w:w="4552" w:type="dxa"/>
+            <w:tcW w:w="4553" w:type="dxa"/>
             <w:gridSpan w:val="2"/>
             <w:tcBorders>
-              <w:top w:val="nil"/>
               <w:start w:val="single" w:sz="4" w:space="0" w:color="808080"/>
-              <w:bottom w:val="nil"/>
               <w:end w:val="single" w:sz="4" w:space="0" w:color="808080"/>
             </w:tcBorders>
             <w:tcMar>
@@ -333,7 +311,7 @@
           <w:p>
             <w:pPr>
               <w:pStyle w:val="Normal"/>
-              <w:widowControl/>
+              <w:widowControl w:val="false"/>
               <w:bidi w:val="0"/>
               <w:spacing w:lineRule="auto" w:line="240" w:before="0" w:after="0"/>
               <w:jc w:val="start"/>
@@ -362,19 +340,16 @@
         <w:trPr/>
         <w:tc>
           <w:tcPr>
-            <w:tcW w:w="5513" w:type="dxa"/>
+            <w:tcW w:w="5512" w:type="dxa"/>
             <w:vMerge w:val="continue"/>
             <w:tcBorders>
-              <w:top w:val="nil"/>
-              <w:start w:val="nil"/>
-              <w:bottom w:val="nil"/>
               <w:end w:val="single" w:sz="4" w:space="0" w:color="808080"/>
             </w:tcBorders>
           </w:tcPr>
           <w:p>
             <w:pPr>
               <w:pStyle w:val="Normal"/>
-              <w:widowControl/>
+              <w:widowControl w:val="false"/>
               <w:bidi w:val="0"/>
               <w:spacing w:lineRule="auto" w:line="240" w:before="0" w:after="0"/>
               <w:jc w:val="start"/>
@@ -399,12 +374,10 @@
         </w:tc>
         <w:tc>
           <w:tcPr>
-            <w:tcW w:w="4552" w:type="dxa"/>
+            <w:tcW w:w="4553" w:type="dxa"/>
             <w:gridSpan w:val="2"/>
             <w:tcBorders>
-              <w:top w:val="nil"/>
               <w:start w:val="single" w:sz="4" w:space="0" w:color="808080"/>
-              <w:bottom w:val="nil"/>
               <w:end w:val="single" w:sz="4" w:space="0" w:color="808080"/>
             </w:tcBorders>
             <w:tcMar>
@@ -415,7 +388,7 @@
           <w:p>
             <w:pPr>
               <w:pStyle w:val="Normal"/>
-              <w:widowControl/>
+              <w:widowControl w:val="false"/>
               <w:bidi w:val="0"/>
               <w:spacing w:lineRule="auto" w:line="240" w:before="0" w:after="0"/>
               <w:jc w:val="start"/>
@@ -443,19 +416,16 @@
         <w:trPr/>
         <w:tc>
           <w:tcPr>
-            <w:tcW w:w="5513" w:type="dxa"/>
+            <w:tcW w:w="5512" w:type="dxa"/>
             <w:vMerge w:val="continue"/>
             <w:tcBorders>
-              <w:top w:val="nil"/>
-              <w:start w:val="nil"/>
-              <w:bottom w:val="nil"/>
               <w:end w:val="single" w:sz="4" w:space="0" w:color="808080"/>
             </w:tcBorders>
           </w:tcPr>
           <w:p>
             <w:pPr>
               <w:pStyle w:val="Normal"/>
-              <w:widowControl/>
+              <w:widowControl w:val="false"/>
               <w:bidi w:val="0"/>
               <w:spacing w:lineRule="auto" w:line="240" w:before="0" w:after="0"/>
               <w:jc w:val="start"/>
@@ -480,12 +450,10 @@
         </w:tc>
         <w:tc>
           <w:tcPr>
-            <w:tcW w:w="4552" w:type="dxa"/>
+            <w:tcW w:w="4553" w:type="dxa"/>
             <w:gridSpan w:val="2"/>
             <w:tcBorders>
-              <w:top w:val="nil"/>
               <w:start w:val="single" w:sz="4" w:space="0" w:color="808080"/>
-              <w:bottom w:val="nil"/>
               <w:end w:val="single" w:sz="4" w:space="0" w:color="808080"/>
             </w:tcBorders>
             <w:tcMar>
@@ -496,7 +464,7 @@
           <w:p>
             <w:pPr>
               <w:pStyle w:val="Normal"/>
-              <w:widowControl/>
+              <w:widowControl w:val="false"/>
               <w:bidi w:val="0"/>
               <w:spacing w:lineRule="auto" w:line="240" w:before="0" w:after="0"/>
               <w:jc w:val="start"/>
@@ -524,19 +492,16 @@
         <w:trPr/>
         <w:tc>
           <w:tcPr>
-            <w:tcW w:w="5513" w:type="dxa"/>
+            <w:tcW w:w="5512" w:type="dxa"/>
             <w:vMerge w:val="continue"/>
             <w:tcBorders>
-              <w:top w:val="nil"/>
-              <w:start w:val="nil"/>
-              <w:bottom w:val="nil"/>
               <w:end w:val="single" w:sz="4" w:space="0" w:color="808080"/>
             </w:tcBorders>
           </w:tcPr>
           <w:p>
             <w:pPr>
               <w:pStyle w:val="Normal"/>
-              <w:widowControl/>
+              <w:widowControl w:val="false"/>
               <w:bidi w:val="0"/>
               <w:spacing w:lineRule="auto" w:line="240" w:before="0" w:after="0"/>
               <w:jc w:val="start"/>
@@ -561,10 +526,9 @@
         </w:tc>
         <w:tc>
           <w:tcPr>
-            <w:tcW w:w="4552" w:type="dxa"/>
+            <w:tcW w:w="4553" w:type="dxa"/>
             <w:gridSpan w:val="2"/>
             <w:tcBorders>
-              <w:top w:val="nil"/>
               <w:start w:val="single" w:sz="4" w:space="0" w:color="808080"/>
               <w:bottom w:val="single" w:sz="4" w:space="0" w:color="808080"/>
               <w:end w:val="single" w:sz="4" w:space="0" w:color="808080"/>
@@ -573,7 +537,7 @@
           <w:p>
             <w:pPr>
               <w:pStyle w:val="Normal"/>
-              <w:widowControl/>
+              <w:widowControl w:val="false"/>
               <w:bidi w:val="0"/>
               <w:spacing w:lineRule="auto" w:line="240" w:before="0" w:after="0"/>
               <w:jc w:val="start"/>
@@ -601,19 +565,14 @@
         <w:trPr/>
         <w:tc>
           <w:tcPr>
-            <w:tcW w:w="5513" w:type="dxa"/>
+            <w:tcW w:w="5512" w:type="dxa"/>
             <w:vMerge w:val="continue"/>
-            <w:tcBorders>
-              <w:top w:val="nil"/>
-              <w:start w:val="nil"/>
-              <w:bottom w:val="nil"/>
-              <w:end w:val="nil"/>
-            </w:tcBorders>
-          </w:tcPr>
-          <w:p>
-            <w:pPr>
-              <w:pStyle w:val="Normal"/>
-              <w:widowControl/>
+            <w:tcBorders/>
+          </w:tcPr>
+          <w:p>
+            <w:pPr>
+              <w:pStyle w:val="Normal"/>
+              <w:widowControl w:val="false"/>
               <w:bidi w:val="0"/>
               <w:spacing w:lineRule="auto" w:line="240" w:before="0" w:after="0"/>
               <w:jc w:val="start"/>
@@ -638,19 +597,16 @@
         </w:tc>
         <w:tc>
           <w:tcPr>
-            <w:tcW w:w="4552" w:type="dxa"/>
+            <w:tcW w:w="4553" w:type="dxa"/>
             <w:gridSpan w:val="2"/>
             <w:tcBorders>
               <w:top w:val="single" w:sz="4" w:space="0" w:color="808080"/>
-              <w:start w:val="nil"/>
-              <w:bottom w:val="nil"/>
-              <w:end w:val="nil"/>
             </w:tcBorders>
           </w:tcPr>
           <w:p>
             <w:pPr>
               <w:pStyle w:val="Normal"/>
-              <w:widowControl/>
+              <w:widowControl w:val="false"/>
               <w:bidi w:val="0"/>
               <w:spacing w:lineRule="auto" w:line="240" w:before="0" w:after="0"/>
               <w:jc w:val="start"/>
@@ -678,23 +634,18 @@
         <w:trPr/>
         <w:tc>
           <w:tcPr>
-            <w:tcW w:w="5513" w:type="dxa"/>
-            <w:tcBorders>
-              <w:top w:val="nil"/>
-              <w:start w:val="nil"/>
-              <w:bottom w:val="nil"/>
-              <w:end w:val="nil"/>
-            </w:tcBorders>
-          </w:tcPr>
-          <w:p>
-            <w:pPr>
-              <w:pStyle w:val="Normal"/>
-              <w:widowControl/>
-              <w:bidi w:val="0"/>
-              <w:spacing w:lineRule="auto" w:line="240" w:before="0" w:after="0"/>
-              <w:jc w:val="start"/>
-              <w:rPr>
-                <w:rFonts w:cs="Calibri" w:cstheme="minorHAnsi"/>
+            <w:tcW w:w="5512" w:type="dxa"/>
+            <w:tcBorders/>
+          </w:tcPr>
+          <w:p>
+            <w:pPr>
+              <w:pStyle w:val="Normal"/>
+              <w:widowControl w:val="false"/>
+              <w:bidi w:val="0"/>
+              <w:spacing w:lineRule="auto" w:line="240" w:before="0" w:after="0"/>
+              <w:jc w:val="start"/>
+              <w:rPr>
+                <w:rFonts w:cs="" w:cstheme="minorHAnsi"/>
               </w:rPr>
             </w:pPr>
             <w:r>
@@ -720,7 +671,7 @@
             </w:r>
             <w:r>
               <w:rPr>
-                <w:rFonts w:eastAsia="" w:cs="Calibri" w:ascii="Calibri" w:hAnsi="Calibri" w:cstheme="minorHAnsi"/>
+                <w:rFonts w:eastAsia="" w:cs="" w:ascii="Calibri" w:hAnsi="Calibri" w:cstheme="minorHAnsi"/>
                 <w:kern w:val="0"/>
                 <w:position w:val="4"/>
                 <w:sz w:val="22"/>
@@ -729,101 +680,28 @@
               </w:rPr>
               <w:t xml:space="preserve"> </w:t>
             </w:r>
-            <w:r>
-              <w:rPr>
-                <w:rFonts w:eastAsia="" w:cs="Arial" w:ascii="Calibri" w:hAnsi="Calibri"/>
-                <w:kern w:val="0"/>
-                <w:sz w:val="22"/>
-                <w:szCs w:val="22"/>
-                <w:lang w:val="sk-SK" w:eastAsia="sk-SK" w:bidi="ar-SA"/>
-              </w:rPr>
-              <w:t>K</w:t>
-            </w:r>
-            <w:sdt>
-              <w:sdtPr>
-                <w:date>
-                  <w:dateFormat w:val="dd. MM. yyyy"/>
-                  <w:lid w:val="sk-SK"/>
-                  <w:storeMappedDataAs w:val="dateTime"/>
-                  <w:calendar w:val="gregorian"/>
-                </w:date>
-                <w:id w:val="1894412268"/>
-                <w:placeholder>
-                  <w:docPart w:val="5682FF16D56F4CD0A14A50F7C0463872"/>
-                </w:placeholder>
-              </w:sdtPr>
-              <w:sdtContent>
-                <w:r>
-                  <w:rPr>
-                    <w:rFonts w:eastAsia="" w:cs="Arial" w:ascii="Calibri" w:hAnsi="Calibri"/>
-                    <w:kern w:val="0"/>
-                    <w:sz w:val="22"/>
-                    <w:szCs w:val="22"/>
-                    <w:lang w:val="sk-SK" w:eastAsia="sk-SK" w:bidi="ar-SA"/>
-                  </w:rPr>
-                </w:r>
-                <w:r>
-                  <w:rPr>
-                    <w:rFonts w:eastAsia="" w:cs="Arial" w:ascii="Calibri" w:hAnsi="Calibri"/>
-                    <w:kern w:val="0"/>
-                    <w:sz w:val="22"/>
-                    <w:szCs w:val="22"/>
-                    <w:lang w:val="sk-SK" w:eastAsia="sk-SK" w:bidi="ar-SA"/>
-                  </w:rPr>
-                  <w:t>liknutím zadáte dátum.</w:t>
-                </w:r>
-                <w:r>
-                  <w:rPr>
-                    <w:rFonts w:eastAsia="" w:cs="Arial" w:ascii="Calibri" w:hAnsi="Calibri"/>
-                    <w:kern w:val="0"/>
-                    <w:sz w:val="22"/>
-                    <w:szCs w:val="22"/>
-                    <w:lang w:val="sk-SK" w:eastAsia="sk-SK" w:bidi="ar-SA"/>
-                  </w:rPr>
-                </w:r>
-              </w:sdtContent>
-            </w:sdt>
-            <w:r>
-              <w:rPr>
-                <w:rFonts w:eastAsia="" w:cs="Arial" w:ascii="Calibri" w:hAnsi="Calibri"/>
-                <w:kern w:val="0"/>
-                <w:sz w:val="22"/>
-                <w:szCs w:val="22"/>
-                <w:lang w:val="sk-SK" w:eastAsia="sk-SK" w:bidi="ar-SA"/>
-              </w:rPr>
-              <w:t xml:space="preserve"> </w:t>
-            </w:r>
-          </w:p>
-        </w:tc>
-        <w:tc>
-          <w:tcPr>
-            <w:tcW w:w="4552" w:type="dxa"/>
+          </w:p>
+        </w:tc>
+        <w:tc>
+          <w:tcPr>
+            <w:tcW w:w="4553" w:type="dxa"/>
             <w:gridSpan w:val="2"/>
-            <w:tcBorders>
-              <w:top w:val="nil"/>
-              <w:start w:val="nil"/>
-              <w:bottom w:val="nil"/>
-              <w:end w:val="nil"/>
-            </w:tcBorders>
-          </w:tcPr>
-          <w:p>
-            <w:pPr>
-              <w:pStyle w:val="Normal"/>
-              <w:widowControl/>
-              <w:bidi w:val="0"/>
-              <w:spacing w:lineRule="auto" w:line="240" w:before="0" w:after="0"/>
-              <w:jc w:val="start"/>
-              <w:rPr>
-                <w:rFonts w:cs="Calibri" w:cstheme="minorHAnsi"/>
-              </w:rPr>
-            </w:pPr>
-            <w:r>
-              <w:rPr>
-                <w:rFonts w:eastAsia="" w:cs="Calibri" w:cstheme="minorHAnsi" w:ascii="Calibri" w:hAnsi="Calibri"/>
-                <w:kern w:val="0"/>
-                <w:sz w:val="22"/>
-                <w:szCs w:val="22"/>
-                <w:lang w:val="sk-SK" w:eastAsia="sk-SK" w:bidi="ar-SA"/>
+            <w:tcBorders/>
+          </w:tcPr>
+          <w:p>
+            <w:pPr>
+              <w:pStyle w:val="Normal"/>
+              <w:widowControl w:val="false"/>
+              <w:bidi w:val="0"/>
+              <w:spacing w:lineRule="auto" w:line="240" w:before="0" w:after="0"/>
+              <w:jc w:val="start"/>
+              <w:rPr>
+                <w:rFonts w:cs="" w:cstheme="minorHAnsi"/>
+              </w:rPr>
+            </w:pPr>
+            <w:r>
+              <w:rPr>
+                <w:rFonts w:cs="" w:cstheme="minorHAnsi"/>
               </w:rPr>
             </w:r>
           </w:p>
@@ -833,18 +711,13 @@
         <w:trPr/>
         <w:tc>
           <w:tcPr>
-            <w:tcW w:w="5513" w:type="dxa"/>
-            <w:tcBorders>
-              <w:top w:val="nil"/>
-              <w:start w:val="nil"/>
-              <w:bottom w:val="nil"/>
-              <w:end w:val="nil"/>
-            </w:tcBorders>
-          </w:tcPr>
-          <w:p>
-            <w:pPr>
-              <w:pStyle w:val="Normal"/>
-              <w:widowControl/>
+            <w:tcW w:w="5512" w:type="dxa"/>
+            <w:tcBorders/>
+          </w:tcPr>
+          <w:p>
+            <w:pPr>
+              <w:pStyle w:val="Normal"/>
+              <w:widowControl w:val="false"/>
               <w:bidi w:val="0"/>
               <w:spacing w:lineRule="auto" w:line="240" w:before="0" w:after="0"/>
               <w:jc w:val="start"/>
@@ -870,17 +743,12 @@
         <w:tc>
           <w:tcPr>
             <w:tcW w:w="20" w:type="dxa"/>
-            <w:tcBorders>
-              <w:top w:val="nil"/>
-              <w:start w:val="nil"/>
-              <w:bottom w:val="nil"/>
-              <w:end w:val="nil"/>
-            </w:tcBorders>
-          </w:tcPr>
-          <w:p>
-            <w:pPr>
-              <w:pStyle w:val="Normal"/>
-              <w:widowControl/>
+            <w:tcBorders/>
+          </w:tcPr>
+          <w:p>
+            <w:pPr>
+              <w:pStyle w:val="Normal"/>
+              <w:widowControl w:val="false"/>
               <w:bidi w:val="0"/>
               <w:spacing w:lineRule="auto" w:line="240" w:before="0" w:after="0"/>
               <w:jc w:val="start"/>
@@ -905,18 +773,13 @@
         </w:tc>
         <w:tc>
           <w:tcPr>
-            <w:tcW w:w="4532" w:type="dxa"/>
-            <w:tcBorders>
-              <w:top w:val="nil"/>
-              <w:start w:val="nil"/>
-              <w:bottom w:val="nil"/>
-              <w:end w:val="nil"/>
-            </w:tcBorders>
-          </w:tcPr>
-          <w:p>
-            <w:pPr>
-              <w:pStyle w:val="Normal"/>
-              <w:widowControl/>
+            <w:tcW w:w="4533" w:type="dxa"/>
+            <w:tcBorders/>
+          </w:tcPr>
+          <w:p>
+            <w:pPr>
+              <w:pStyle w:val="Normal"/>
+              <w:widowControl w:val="false"/>
               <w:bidi w:val="0"/>
               <w:spacing w:lineRule="auto" w:line="240" w:before="0" w:after="0"/>
               <w:jc w:val="start"/>
@@ -948,17 +811,12 @@
           <w:tcPr>
             <w:tcW w:w="10065" w:type="dxa"/>
             <w:gridSpan w:val="3"/>
-            <w:tcBorders>
-              <w:top w:val="nil"/>
-              <w:start w:val="nil"/>
-              <w:bottom w:val="nil"/>
-              <w:end w:val="nil"/>
-            </w:tcBorders>
-          </w:tcPr>
-          <w:p>
-            <w:pPr>
-              <w:pStyle w:val="Normal"/>
-              <w:widowControl/>
+            <w:tcBorders/>
+          </w:tcPr>
+          <w:p>
+            <w:pPr>
+              <w:pStyle w:val="Normal"/>
+              <w:widowControl w:val="false"/>
               <w:bidi w:val="0"/>
               <w:spacing w:lineRule="auto" w:line="276" w:before="0" w:after="0"/>
               <w:jc w:val="start"/>
@@ -985,7 +843,7 @@
           <w:p>
             <w:pPr>
               <w:pStyle w:val="Normal"/>
-              <w:widowControl/>
+              <w:widowControl w:val="false"/>
               <w:bidi w:val="0"/>
               <w:spacing w:lineRule="auto" w:line="240" w:before="0" w:after="0"/>
               <w:jc w:val="start"/>
@@ -1075,23 +933,21 @@
       </w:tblPr>
       <w:tblGrid>
         <w:gridCol w:w="2547"/>
-        <w:gridCol w:w="6804"/>
+        <w:gridCol w:w="6803"/>
       </w:tblGrid>
       <w:tr>
         <w:trPr/>
         <w:tc>
           <w:tcPr>
             <w:tcW w:w="2547" w:type="dxa"/>
-            <w:tcBorders>
-              <w:end w:val="nil"/>
-            </w:tcBorders>
+            <w:tcBorders/>
             <w:shd w:color="auto" w:fill="auto" w:val="clear"/>
             <w:vAlign w:val="center"/>
           </w:tcPr>
           <w:p>
             <w:pPr>
               <w:pStyle w:val="ListParagraph"/>
-              <w:widowControl/>
+              <w:widowControl w:val="false"/>
               <w:bidi w:val="0"/>
               <w:spacing w:lineRule="auto" w:line="276" w:before="0" w:after="160"/>
               <w:ind w:start="0" w:hanging="0"/>
@@ -1116,17 +972,15 @@
         </w:tc>
         <w:tc>
           <w:tcPr>
-            <w:tcW w:w="6804" w:type="dxa"/>
-            <w:tcBorders>
-              <w:start w:val="nil"/>
-            </w:tcBorders>
+            <w:tcW w:w="6803" w:type="dxa"/>
+            <w:tcBorders/>
             <w:shd w:color="auto" w:fill="auto" w:val="clear"/>
             <w:vAlign w:val="center"/>
           </w:tcPr>
           <w:p>
             <w:pPr>
               <w:pStyle w:val="Normal"/>
-              <w:widowControl/>
+              <w:widowControl w:val="false"/>
               <w:bidi w:val="0"/>
               <w:spacing w:lineRule="auto" w:line="276" w:before="0" w:after="0"/>
               <w:jc w:val="start"/>
@@ -1136,9 +990,7 @@
             </w:pPr>
             <w:r>
               <w:rPr>
-                <w:sz w:val="22"/>
-                <w:szCs w:val="22"/>
-                <w:lang w:val="sk-SK" w:bidi="ar-SA"/>
+                <w:rFonts w:cs="Calibri" w:ascii="Calibri" w:hAnsi="Calibri"/>
               </w:rPr>
             </w:r>
           </w:p>
@@ -1149,16 +1001,14 @@
         <w:tc>
           <w:tcPr>
             <w:tcW w:w="2547" w:type="dxa"/>
-            <w:tcBorders>
-              <w:end w:val="nil"/>
-            </w:tcBorders>
+            <w:tcBorders/>
             <w:shd w:color="auto" w:fill="auto" w:val="clear"/>
             <w:vAlign w:val="center"/>
           </w:tcPr>
           <w:p>
             <w:pPr>
               <w:pStyle w:val="Normal"/>
-              <w:widowControl/>
+              <w:widowControl w:val="false"/>
               <w:bidi w:val="0"/>
               <w:spacing w:lineRule="auto" w:line="276" w:before="0" w:after="0"/>
               <w:jc w:val="start"/>
@@ -1185,17 +1035,15 @@
         </w:tc>
         <w:tc>
           <w:tcPr>
-            <w:tcW w:w="6804" w:type="dxa"/>
-            <w:tcBorders>
-              <w:start w:val="nil"/>
-            </w:tcBorders>
+            <w:tcW w:w="6803" w:type="dxa"/>
+            <w:tcBorders/>
             <w:shd w:color="auto" w:fill="auto" w:val="clear"/>
             <w:vAlign w:val="center"/>
           </w:tcPr>
           <w:p>
             <w:pPr>
               <w:pStyle w:val="ListParagraph"/>
-              <w:widowControl/>
+              <w:widowControl w:val="false"/>
               <w:bidi w:val="0"/>
               <w:spacing w:lineRule="auto" w:line="276" w:before="0" w:after="160"/>
               <w:ind w:start="0" w:hanging="0"/>
@@ -1210,9 +1058,9 @@
             </w:pPr>
             <w:r>
               <w:rPr>
-                <w:sz w:val="22"/>
-                <w:szCs w:val="22"/>
-                <w:lang w:val="sk-SK" w:bidi="ar-SA"/>
+                <w:rFonts w:cs="Calibri" w:ascii="Calibri" w:hAnsi="Calibri"/>
+                <w:b/>
+                <w:bCs/>
               </w:rPr>
             </w:r>
           </w:p>
@@ -1258,23 +1106,21 @@
       </w:tblPr>
       <w:tblGrid>
         <w:gridCol w:w="2547"/>
-        <w:gridCol w:w="6804"/>
+        <w:gridCol w:w="6803"/>
       </w:tblGrid>
       <w:tr>
         <w:trPr/>
         <w:tc>
           <w:tcPr>
             <w:tcW w:w="2547" w:type="dxa"/>
-            <w:tcBorders>
-              <w:end w:val="nil"/>
-            </w:tcBorders>
+            <w:tcBorders/>
             <w:shd w:color="auto" w:fill="D9D9D9" w:themeFill="background1" w:themeFillShade="d9" w:val="clear"/>
             <w:vAlign w:val="center"/>
           </w:tcPr>
           <w:p>
             <w:pPr>
               <w:pStyle w:val="Normal"/>
-              <w:widowControl/>
+              <w:widowControl w:val="false"/>
               <w:bidi w:val="0"/>
               <w:spacing w:lineRule="auto" w:line="276" w:before="0" w:after="0"/>
               <w:jc w:val="start"/>
@@ -1301,17 +1147,15 @@
         </w:tc>
         <w:tc>
           <w:tcPr>
-            <w:tcW w:w="6804" w:type="dxa"/>
-            <w:tcBorders>
-              <w:start w:val="nil"/>
-            </w:tcBorders>
+            <w:tcW w:w="6803" w:type="dxa"/>
+            <w:tcBorders/>
             <w:shd w:color="auto" w:fill="D9D9D9" w:themeFill="background1" w:themeFillShade="d9" w:val="clear"/>
             <w:vAlign w:val="center"/>
           </w:tcPr>
           <w:p>
             <w:pPr>
               <w:pStyle w:val="ListParagraph"/>
-              <w:widowControl/>
+              <w:widowControl w:val="false"/>
               <w:bidi w:val="0"/>
               <w:spacing w:lineRule="auto" w:line="276" w:before="0" w:after="160"/>
               <w:ind w:start="0" w:hanging="0"/>
@@ -1329,9 +1173,6 @@
                 <w:rFonts w:cs="Calibri" w:ascii="Calibri" w:hAnsi="Calibri"/>
                 <w:b/>
                 <w:bCs/>
-                <w:sz w:val="22"/>
-                <w:szCs w:val="22"/>
-                <w:lang w:val="sk-SK" w:bidi="ar-SA"/>
               </w:rPr>
             </w:r>
           </w:p>
@@ -1342,16 +1183,14 @@
         <w:tc>
           <w:tcPr>
             <w:tcW w:w="2547" w:type="dxa"/>
-            <w:tcBorders>
-              <w:end w:val="nil"/>
-            </w:tcBorders>
+            <w:tcBorders/>
             <w:shd w:color="auto" w:fill="auto" w:val="clear"/>
             <w:vAlign w:val="center"/>
           </w:tcPr>
           <w:p>
             <w:pPr>
               <w:pStyle w:val="ListParagraph"/>
-              <w:widowControl/>
+              <w:widowControl w:val="false"/>
               <w:bidi w:val="0"/>
               <w:spacing w:lineRule="auto" w:line="276" w:before="0" w:after="160"/>
               <w:ind w:start="0" w:hanging="0"/>
@@ -1379,7 +1218,7 @@
           <w:p>
             <w:pPr>
               <w:pStyle w:val="ListParagraph"/>
-              <w:widowControl/>
+              <w:widowControl w:val="false"/>
               <w:bidi w:val="0"/>
               <w:spacing w:lineRule="auto" w:line="276" w:before="0" w:after="160"/>
               <w:ind w:start="0" w:hanging="0"/>
@@ -1407,17 +1246,15 @@
         </w:tc>
         <w:tc>
           <w:tcPr>
-            <w:tcW w:w="6804" w:type="dxa"/>
-            <w:tcBorders>
-              <w:start w:val="nil"/>
-            </w:tcBorders>
+            <w:tcW w:w="6803" w:type="dxa"/>
+            <w:tcBorders/>
             <w:shd w:color="auto" w:fill="auto" w:val="clear"/>
             <w:vAlign w:val="center"/>
           </w:tcPr>
           <w:p>
             <w:pPr>
               <w:pStyle w:val="ListParagraph"/>
-              <w:widowControl/>
+              <w:widowControl w:val="false"/>
               <w:bidi w:val="0"/>
               <w:spacing w:lineRule="auto" w:line="276" w:before="0" w:after="160"/>
               <w:ind w:start="0" w:hanging="0"/>
@@ -1429,9 +1266,7 @@
             </w:pPr>
             <w:r>
               <w:rPr>
-                <w:sz w:val="22"/>
-                <w:szCs w:val="22"/>
-                <w:lang w:val="sk-SK" w:bidi="ar-SA"/>
+                <w:rFonts w:cs="Calibri" w:ascii="Calibri" w:hAnsi="Calibri"/>
               </w:rPr>
             </w:r>
           </w:p>
@@ -1442,16 +1277,14 @@
         <w:tc>
           <w:tcPr>
             <w:tcW w:w="2547" w:type="dxa"/>
-            <w:tcBorders>
-              <w:end w:val="nil"/>
-            </w:tcBorders>
+            <w:tcBorders/>
             <w:shd w:color="auto" w:fill="auto" w:val="clear"/>
             <w:vAlign w:val="center"/>
           </w:tcPr>
           <w:p>
             <w:pPr>
               <w:pStyle w:val="ListParagraph"/>
-              <w:widowControl/>
+              <w:widowControl w:val="false"/>
               <w:bidi w:val="0"/>
               <w:spacing w:lineRule="auto" w:line="276" w:before="0" w:after="160"/>
               <w:ind w:start="0" w:hanging="0"/>
@@ -1479,17 +1312,15 @@
         </w:tc>
         <w:tc>
           <w:tcPr>
-            <w:tcW w:w="6804" w:type="dxa"/>
-            <w:tcBorders>
-              <w:start w:val="nil"/>
-            </w:tcBorders>
+            <w:tcW w:w="6803" w:type="dxa"/>
+            <w:tcBorders/>
             <w:shd w:color="auto" w:fill="auto" w:val="clear"/>
             <w:vAlign w:val="center"/>
           </w:tcPr>
           <w:p>
             <w:pPr>
               <w:pStyle w:val="ListParagraph"/>
-              <w:widowControl/>
+              <w:widowControl w:val="false"/>
               <w:bidi w:val="0"/>
               <w:spacing w:lineRule="auto" w:line="276" w:before="0" w:after="160"/>
               <w:ind w:start="0" w:hanging="0"/>
@@ -1501,9 +1332,7 @@
             </w:pPr>
             <w:r>
               <w:rPr>
-                <w:sz w:val="22"/>
-                <w:szCs w:val="22"/>
-                <w:lang w:val="sk-SK" w:bidi="ar-SA"/>
+                <w:rFonts w:cs="Calibri" w:ascii="Calibri" w:hAnsi="Calibri"/>
               </w:rPr>
             </w:r>
           </w:p>
@@ -1514,16 +1343,14 @@
         <w:tc>
           <w:tcPr>
             <w:tcW w:w="2547" w:type="dxa"/>
-            <w:tcBorders>
-              <w:end w:val="nil"/>
-            </w:tcBorders>
+            <w:tcBorders/>
             <w:shd w:color="auto" w:fill="auto" w:val="clear"/>
             <w:vAlign w:val="center"/>
           </w:tcPr>
           <w:p>
             <w:pPr>
               <w:pStyle w:val="ListParagraph"/>
-              <w:widowControl/>
+              <w:widowControl w:val="false"/>
               <w:bidi w:val="0"/>
               <w:spacing w:lineRule="auto" w:line="276" w:before="0" w:after="160"/>
               <w:ind w:start="0" w:hanging="0"/>
@@ -1551,17 +1378,15 @@
         </w:tc>
         <w:tc>
           <w:tcPr>
-            <w:tcW w:w="6804" w:type="dxa"/>
-            <w:tcBorders>
-              <w:start w:val="nil"/>
-            </w:tcBorders>
+            <w:tcW w:w="6803" w:type="dxa"/>
+            <w:tcBorders/>
             <w:shd w:color="auto" w:fill="auto" w:val="clear"/>
             <w:vAlign w:val="center"/>
           </w:tcPr>
           <w:p>
             <w:pPr>
               <w:pStyle w:val="ListParagraph"/>
-              <w:widowControl/>
+              <w:widowControl w:val="false"/>
               <w:bidi w:val="0"/>
               <w:spacing w:lineRule="auto" w:line="276" w:before="0" w:after="160"/>
               <w:ind w:start="0" w:hanging="0"/>
@@ -1573,9 +1398,7 @@
             </w:pPr>
             <w:r>
               <w:rPr>
-                <w:sz w:val="22"/>
-                <w:szCs w:val="22"/>
-                <w:lang w:val="sk-SK" w:bidi="ar-SA"/>
+                <w:rFonts w:cs="Calibri" w:ascii="Calibri" w:hAnsi="Calibri"/>
               </w:rPr>
             </w:r>
           </w:p>
@@ -1586,16 +1409,14 @@
         <w:tc>
           <w:tcPr>
             <w:tcW w:w="2547" w:type="dxa"/>
-            <w:tcBorders>
-              <w:end w:val="nil"/>
-            </w:tcBorders>
+            <w:tcBorders/>
             <w:shd w:color="auto" w:fill="auto" w:val="clear"/>
             <w:vAlign w:val="center"/>
           </w:tcPr>
           <w:p>
             <w:pPr>
               <w:pStyle w:val="ListParagraph"/>
-              <w:widowControl/>
+              <w:widowControl w:val="false"/>
               <w:bidi w:val="0"/>
               <w:spacing w:lineRule="auto" w:line="276" w:before="0" w:after="160"/>
               <w:ind w:start="0" w:hanging="0"/>
@@ -1623,17 +1444,15 @@
         </w:tc>
         <w:tc>
           <w:tcPr>
-            <w:tcW w:w="6804" w:type="dxa"/>
-            <w:tcBorders>
-              <w:start w:val="nil"/>
-            </w:tcBorders>
+            <w:tcW w:w="6803" w:type="dxa"/>
+            <w:tcBorders/>
             <w:shd w:color="auto" w:fill="auto" w:val="clear"/>
             <w:vAlign w:val="center"/>
           </w:tcPr>
           <w:p>
             <w:pPr>
               <w:pStyle w:val="ListParagraph"/>
-              <w:widowControl/>
+              <w:widowControl w:val="false"/>
               <w:bidi w:val="0"/>
               <w:spacing w:lineRule="auto" w:line="276" w:before="0" w:after="160"/>
               <w:ind w:start="0" w:hanging="0"/>
@@ -1645,9 +1464,7 @@
             </w:pPr>
             <w:r>
               <w:rPr>
-                <w:sz w:val="22"/>
-                <w:szCs w:val="22"/>
-                <w:lang w:val="sk-SK" w:bidi="ar-SA"/>
+                <w:rFonts w:cs="Calibri" w:ascii="Calibri" w:hAnsi="Calibri"/>
               </w:rPr>
             </w:r>
           </w:p>
@@ -1693,23 +1510,21 @@
       </w:tblPr>
       <w:tblGrid>
         <w:gridCol w:w="2547"/>
-        <w:gridCol w:w="6804"/>
+        <w:gridCol w:w="6803"/>
       </w:tblGrid>
       <w:tr>
         <w:trPr/>
         <w:tc>
           <w:tcPr>
             <w:tcW w:w="2547" w:type="dxa"/>
-            <w:tcBorders>
-              <w:end w:val="nil"/>
-            </w:tcBorders>
+            <w:tcBorders/>
             <w:shd w:color="auto" w:fill="D9D9D9" w:themeFill="background1" w:themeFillShade="d9" w:val="clear"/>
             <w:vAlign w:val="center"/>
           </w:tcPr>
           <w:p>
             <w:pPr>
               <w:pStyle w:val="ListParagraph"/>
-              <w:widowControl/>
+              <w:widowControl w:val="false"/>
               <w:bidi w:val="0"/>
               <w:spacing w:lineRule="auto" w:line="276" w:before="0" w:after="160"/>
               <w:ind w:start="0" w:hanging="0"/>
@@ -1737,17 +1552,15 @@
         </w:tc>
         <w:tc>
           <w:tcPr>
-            <w:tcW w:w="6804" w:type="dxa"/>
-            <w:tcBorders>
-              <w:start w:val="nil"/>
-            </w:tcBorders>
+            <w:tcW w:w="6803" w:type="dxa"/>
+            <w:tcBorders/>
             <w:shd w:color="auto" w:fill="D9D9D9" w:themeFill="background1" w:themeFillShade="d9" w:val="clear"/>
             <w:vAlign w:val="center"/>
           </w:tcPr>
           <w:p>
             <w:pPr>
               <w:pStyle w:val="Normal"/>
-              <w:widowControl/>
+              <w:widowControl w:val="false"/>
               <w:bidi w:val="0"/>
               <w:spacing w:lineRule="auto" w:line="276" w:before="0" w:after="0"/>
               <w:jc w:val="start"/>
@@ -1760,13 +1573,9 @@
             </w:pPr>
             <w:r>
               <w:rPr>
-                <w:rFonts w:eastAsia="" w:cs="Calibri" w:ascii="Calibri" w:hAnsi="Calibri"/>
-                <w:b/>
-                <w:bCs/>
-                <w:kern w:val="0"/>
-                <w:sz w:val="22"/>
-                <w:szCs w:val="22"/>
-                <w:lang w:val="sk-SK" w:eastAsia="sk-SK" w:bidi="ar-SA"/>
+                <w:rFonts w:cs="Calibri" w:ascii="Calibri" w:hAnsi="Calibri"/>
+                <w:b/>
+                <w:bCs/>
               </w:rPr>
             </w:r>
           </w:p>
@@ -1777,16 +1586,14 @@
         <w:tc>
           <w:tcPr>
             <w:tcW w:w="2547" w:type="dxa"/>
-            <w:tcBorders>
-              <w:end w:val="nil"/>
-            </w:tcBorders>
+            <w:tcBorders/>
             <w:shd w:color="auto" w:fill="auto" w:val="clear"/>
             <w:vAlign w:val="center"/>
           </w:tcPr>
           <w:p>
             <w:pPr>
               <w:pStyle w:val="ListParagraph"/>
-              <w:widowControl/>
+              <w:widowControl w:val="false"/>
               <w:bidi w:val="0"/>
               <w:spacing w:lineRule="auto" w:line="276" w:before="0" w:after="160"/>
               <w:ind w:start="0" w:hanging="0"/>
@@ -1814,17 +1621,15 @@
         </w:tc>
         <w:tc>
           <w:tcPr>
-            <w:tcW w:w="6804" w:type="dxa"/>
-            <w:tcBorders>
-              <w:start w:val="nil"/>
-            </w:tcBorders>
+            <w:tcW w:w="6803" w:type="dxa"/>
+            <w:tcBorders/>
             <w:shd w:color="auto" w:fill="auto" w:val="clear"/>
             <w:vAlign w:val="center"/>
           </w:tcPr>
           <w:p>
             <w:pPr>
               <w:pStyle w:val="ListParagraph"/>
-              <w:widowControl/>
+              <w:widowControl w:val="false"/>
               <w:bidi w:val="0"/>
               <w:spacing w:lineRule="auto" w:line="276" w:before="0" w:after="160"/>
               <w:ind w:start="0" w:hanging="0"/>
@@ -1840,9 +1645,10 @@
             </w:pPr>
             <w:r>
               <w:rPr>
-                <w:sz w:val="22"/>
-                <w:szCs w:val="22"/>
-                <w:lang w:val="sk-SK" w:bidi="ar-SA"/>
+                <w:rFonts w:cs="Calibri" w:ascii="Calibri" w:hAnsi="Calibri"/>
+                <w:b/>
+                <w:bCs/>
+                <w:highlight w:val="yellow"/>
               </w:rPr>
             </w:r>
           </w:p>
@@ -1877,23 +1683,21 @@
       </w:tblPr>
       <w:tblGrid>
         <w:gridCol w:w="2547"/>
-        <w:gridCol w:w="6804"/>
+        <w:gridCol w:w="6803"/>
       </w:tblGrid>
       <w:tr>
         <w:trPr/>
         <w:tc>
           <w:tcPr>
             <w:tcW w:w="2547" w:type="dxa"/>
-            <w:tcBorders>
-              <w:end w:val="nil"/>
-            </w:tcBorders>
+            <w:tcBorders/>
             <w:shd w:color="auto" w:fill="auto" w:val="clear"/>
             <w:vAlign w:val="center"/>
           </w:tcPr>
           <w:p>
             <w:pPr>
               <w:pStyle w:val="ListParagraph"/>
-              <w:widowControl/>
+              <w:widowControl w:val="false"/>
               <w:bidi w:val="0"/>
               <w:spacing w:lineRule="auto" w:line="276" w:before="0" w:after="160"/>
               <w:ind w:start="0" w:hanging="0"/>
@@ -1921,17 +1725,15 @@
         </w:tc>
         <w:tc>
           <w:tcPr>
-            <w:tcW w:w="6804" w:type="dxa"/>
-            <w:tcBorders>
-              <w:start w:val="nil"/>
-            </w:tcBorders>
+            <w:tcW w:w="6803" w:type="dxa"/>
+            <w:tcBorders/>
             <w:shd w:color="auto" w:fill="auto" w:val="clear"/>
             <w:vAlign w:val="center"/>
           </w:tcPr>
           <w:p>
             <w:pPr>
               <w:pStyle w:val="ListParagraph"/>
-              <w:widowControl/>
+              <w:widowControl w:val="false"/>
               <w:bidi w:val="0"/>
               <w:spacing w:lineRule="auto" w:line="276" w:before="0" w:after="160"/>
               <w:ind w:start="0" w:hanging="0"/>
@@ -1943,16 +1745,14 @@
             </w:pPr>
             <w:r>
               <w:rPr>
-                <w:sz w:val="22"/>
-                <w:szCs w:val="22"/>
-                <w:lang w:val="sk-SK" w:bidi="ar-SA"/>
+                <w:rFonts w:cs="Calibri" w:ascii="Calibri" w:hAnsi="Calibri"/>
               </w:rPr>
             </w:r>
           </w:p>
           <w:p>
             <w:pPr>
               <w:pStyle w:val="ListParagraph"/>
-              <w:widowControl/>
+              <w:widowControl w:val="false"/>
               <w:bidi w:val="0"/>
               <w:spacing w:lineRule="auto" w:line="276" w:before="0" w:after="160"/>
               <w:ind w:start="0" w:hanging="0"/>
@@ -1965,9 +1765,6 @@
             <w:r>
               <w:rPr>
                 <w:rFonts w:cs="Calibri" w:ascii="Calibri" w:hAnsi="Calibri"/>
-                <w:sz w:val="22"/>
-                <w:szCs w:val="22"/>
-                <w:lang w:val="sk-SK" w:bidi="ar-SA"/>
               </w:rPr>
             </w:r>
           </w:p>
@@ -2002,23 +1799,21 @@
       </w:tblPr>
       <w:tblGrid>
         <w:gridCol w:w="2547"/>
-        <w:gridCol w:w="6804"/>
+        <w:gridCol w:w="6803"/>
       </w:tblGrid>
       <w:tr>
         <w:trPr/>
         <w:tc>
           <w:tcPr>
             <w:tcW w:w="2547" w:type="dxa"/>
-            <w:tcBorders>
-              <w:end w:val="nil"/>
-            </w:tcBorders>
+            <w:tcBorders/>
             <w:shd w:color="auto" w:fill="auto" w:val="clear"/>
             <w:vAlign w:val="center"/>
           </w:tcPr>
           <w:p>
             <w:pPr>
               <w:pStyle w:val="ListParagraph"/>
-              <w:widowControl/>
+              <w:widowControl w:val="false"/>
               <w:bidi w:val="0"/>
               <w:spacing w:lineRule="auto" w:line="276" w:before="0" w:after="160"/>
               <w:ind w:start="0" w:hanging="0"/>
@@ -2046,17 +1841,15 @@
         </w:tc>
         <w:tc>
           <w:tcPr>
-            <w:tcW w:w="6804" w:type="dxa"/>
-            <w:tcBorders>
-              <w:start w:val="nil"/>
-            </w:tcBorders>
+            <w:tcW w:w="6803" w:type="dxa"/>
+            <w:tcBorders/>
             <w:shd w:color="auto" w:fill="auto" w:val="clear"/>
             <w:vAlign w:val="center"/>
           </w:tcPr>
           <w:p>
             <w:pPr>
               <w:pStyle w:val="ListParagraph"/>
-              <w:widowControl/>
+              <w:widowControl w:val="false"/>
               <w:bidi w:val="0"/>
               <w:spacing w:lineRule="auto" w:line="276" w:before="0" w:after="160"/>
               <w:ind w:start="0" w:hanging="0"/>
@@ -2068,16 +1861,14 @@
             </w:pPr>
             <w:r>
               <w:rPr>
-                <w:sz w:val="22"/>
-                <w:szCs w:val="22"/>
-                <w:lang w:val="sk-SK" w:bidi="ar-SA"/>
+                <w:rFonts w:cs="Calibri" w:ascii="Calibri" w:hAnsi="Calibri"/>
               </w:rPr>
             </w:r>
           </w:p>
           <w:p>
             <w:pPr>
               <w:pStyle w:val="ListParagraph"/>
-              <w:widowControl/>
+              <w:widowControl w:val="false"/>
               <w:bidi w:val="0"/>
               <w:spacing w:lineRule="auto" w:line="276" w:before="0" w:after="160"/>
               <w:ind w:start="0" w:hanging="0"/>
@@ -2090,9 +1881,6 @@
             <w:r>
               <w:rPr>
                 <w:rFonts w:cs="Calibri" w:ascii="Calibri" w:hAnsi="Calibri"/>
-                <w:sz w:val="22"/>
-                <w:szCs w:val="22"/>
-                <w:lang w:val="sk-SK" w:bidi="ar-SA"/>
               </w:rPr>
             </w:r>
           </w:p>
@@ -2117,6 +1905,7 @@
       <w:pgNumType w:fmt="decimal"/>
       <w:formProt w:val="false"/>
       <w:textDirection w:val="lrTb"/>
+      <w:docGrid w:type="default" w:linePitch="100" w:charSpace="0"/>
     </w:sectPr>
   </w:body>
 </w:document>
@@ -2145,7 +1934,10 @@
     <w:qFormat/>
     <w:pPr>
       <w:widowControl w:val="false"/>
+      <w:suppressAutoHyphens w:val="true"/>
       <w:bidi w:val="0"/>
+      <w:spacing w:before="0" w:after="0"/>
+      <w:jc w:val="start"/>
     </w:pPr>
     <w:rPr>
       <w:rFonts w:ascii="Liberation Serif" w:hAnsi="Liberation Serif" w:eastAsia="Noto Serif CJK SC" w:cs="Lohit Devanagari"/>
@@ -2224,11 +2016,18 @@
       <w:contextualSpacing/>
     </w:pPr>
     <w:rPr>
-      <w:rFonts w:eastAsia="Calibri" w:eastAsiaTheme="minorHAnsi"/>
+      <w:rFonts w:eastAsia="" w:eastAsiaTheme="minorHAnsi"/>
       <w:kern w:val="2"/>
       <w:lang w:eastAsia="en-US"/>
       <w14:ligatures w14:val="standardContextual"/>
     </w:rPr>
   </w:style>
+  <w:style w:type="paragraph" w:styleId="FrameContents">
+    <w:name w:val="Frame Contents"/>
+    <w:basedOn w:val="Normal"/>
+    <w:qFormat/>
+    <w:pPr/>
+    <w:rPr/>
+  </w:style>
 </w:styles>
 </file>
</xml_diff>